<commit_message>
Add Use Case 7 (continuous modernization, remote) with findings/lessons
Covers the atx ct workflow: GitHub source registration, remote
analysis on the aws-managed fleet, remote remediation on
customer-provisioned EC2 (opened and merged real GitHub PRs), and
teardown. Documents real operational findings hit along the way: the
aws-managed/remediation mode split, NAT-egress subnet requirements,
account VPC quota limits, an org tag-policy collision, and token
scope/handling issues.

Co-Authored-By: Claude Sonnet 5 <noreply@anthropic.com>
</commit_message>
<xml_diff>
--- a/AWS-Transform-Use-Cases-and-Solutions.docx
+++ b/AWS-Transform-Use-Cases-and-Solutions.docx
@@ -20,7 +20,7 @@
           <w:color w:val="444444"/>
           <w:sz w:val="30"/>
         </w:rPr>
-        <w:t>Six runtime-upgrade problems, solved with AWS Transform managed transformations</w:t>
+        <w:t>Seven runtime-upgrade problems, solved with AWS Transform managed transformations</w:t>
       </w:r>
     </w:p>
     <w:p>
@@ -2745,6 +2745,583 @@
           <w:i/>
         </w:rPr>
         <w:t>One honest nuance: the tool used datetime.timezone.utc rather than the newer datetime.UTC alias the deprecation message itself suggests — both are fully correct and equivalent, just a different spelling of the same fix.</w:t>
+      </w:r>
+    </w:p>
+    <w:p>
+      <w:pPr>
+        <w:pStyle w:val="Heading1"/>
+      </w:pPr>
+      <w:r>
+        <w:t>Use Case 7: Continuously Monitoring and Remediating Repos on Real Infrastructure</w:t>
+      </w:r>
+    </w:p>
+    <w:p>
+      <w:pPr>
+        <w:pStyle w:val="Heading2"/>
+      </w:pPr>
+      <w:r>
+        <w:t>Problem Statement</w:t>
+      </w:r>
+    </w:p>
+    <w:p>
+      <w:r>
+        <w:rPr>
+          <w:b w:val="0"/>
+          <w:i w:val="0"/>
+        </w:rPr>
+        <w:t>Use Cases 1-6 all ran atx synchronously on a single developer’s laptop — useful for one-off upgrades, but not how a team would manage upgrades across many repositories over time. A team needs to: connect real hosted repositories (GitHub/GitLab/Bitbucket), run analysis and remediation without depending on anyone’s personal machine, and receive results as normal pull requests rather than manual git operations.</w:t>
+      </w:r>
+    </w:p>
+    <w:p>
+      <w:pPr>
+        <w:pStyle w:val="Heading2"/>
+      </w:pPr>
+      <w:r>
+        <w:t>Solution</w:t>
+      </w:r>
+    </w:p>
+    <w:p>
+      <w:r>
+        <w:rPr>
+          <w:b w:val="0"/>
+          <w:i w:val="0"/>
+        </w:rPr>
+        <w:t>Used AWS Transform’s continuous modernization feature (atx ct) — a separate, larger command surface from the single-repo atx custom def exec used in Use Cases 1-6. Registered a real GitHub source connection, ran analysis on AWS’s managed fleet (no infrastructure to provision), then ran remediation on a dedicated EC2 instance provisioned for the purpose (remediation has no managed-fleet option — confirmed both by AWS’s own documentation and by testing it directly). Remediation opened real pull requests automatically.</w:t>
+      </w:r>
+    </w:p>
+    <w:p>
+      <w:pPr>
+        <w:pStyle w:val="Heading2"/>
+      </w:pPr>
+      <w:r>
+        <w:t>Commands</w:t>
+      </w:r>
+    </w:p>
+    <w:p>
+      <w:pPr>
+        <w:spacing w:before="80" w:after="160"/>
+        <w:ind w:left="360"/>
+        <w:shd w:val="clear" w:color="auto" w:fill="F2F2F2"/>
+      </w:pPr>
+      <w:r>
+        <w:rPr>
+          <w:rFonts w:ascii="Consolas" w:hAnsi="Consolas"/>
+          <w:color w:val="1A1A1A"/>
+          <w:sz w:val="18"/>
+        </w:rPr>
+        <w:t># 1. Register a GitHub source and discover repos</w:t>
+      </w:r>
+      <w:r>
+        <w:br/>
+      </w:r>
+      <w:r>
+        <w:rPr>
+          <w:rFonts w:ascii="Consolas" w:hAnsi="Consolas"/>
+          <w:color w:val="1A1A1A"/>
+          <w:sz w:val="18"/>
+        </w:rPr>
+        <w:t>atx ct source add --name gh-demo --provider github --org umzahid --token &lt;PAT&gt;</w:t>
+      </w:r>
+      <w:r>
+        <w:br/>
+      </w:r>
+      <w:r>
+        <w:rPr>
+          <w:rFonts w:ascii="Consolas" w:hAnsi="Consolas"/>
+          <w:color w:val="1A1A1A"/>
+          <w:sz w:val="18"/>
+        </w:rPr>
+        <w:t>atx ct discovery scan --source gh-demo</w:t>
+      </w:r>
+      <w:r>
+        <w:br/>
+      </w:r>
+      <w:r>
+        <w:rPr>
+          <w:rFonts w:ascii="Consolas" w:hAnsi="Consolas"/>
+          <w:color w:val="1A1A1A"/>
+          <w:sz w:val="18"/>
+        </w:rPr>
+        <w:t xml:space="preserve"> </w:t>
+      </w:r>
+      <w:r>
+        <w:br/>
+      </w:r>
+      <w:r>
+        <w:rPr>
+          <w:rFonts w:ascii="Consolas" w:hAnsi="Consolas"/>
+          <w:color w:val="1A1A1A"/>
+          <w:sz w:val="18"/>
+        </w:rPr>
+        <w:t># 2. Run analysis on AWS's managed fleet (no infrastructure needed)</w:t>
+      </w:r>
+      <w:r>
+        <w:br/>
+      </w:r>
+      <w:r>
+        <w:rPr>
+          <w:rFonts w:ascii="Consolas" w:hAnsi="Consolas"/>
+          <w:color w:val="1A1A1A"/>
+          <w:sz w:val="18"/>
+        </w:rPr>
+        <w:t>atx ct remote analysis --repos "gh-demo::repo-a,gh-demo::repo-b" \</w:t>
+      </w:r>
+      <w:r>
+        <w:br/>
+      </w:r>
+      <w:r>
+        <w:rPr>
+          <w:rFonts w:ascii="Consolas" w:hAnsi="Consolas"/>
+          <w:color w:val="1A1A1A"/>
+          <w:sz w:val="18"/>
+        </w:rPr>
+        <w:t xml:space="preserve">  --type modernization-readiness --mode aws-managed</w:t>
+      </w:r>
+      <w:r>
+        <w:br/>
+      </w:r>
+      <w:r>
+        <w:rPr>
+          <w:rFonts w:ascii="Consolas" w:hAnsi="Consolas"/>
+          <w:color w:val="1A1A1A"/>
+          <w:sz w:val="18"/>
+        </w:rPr>
+        <w:t xml:space="preserve"> </w:t>
+      </w:r>
+      <w:r>
+        <w:br/>
+      </w:r>
+      <w:r>
+        <w:rPr>
+          <w:rFonts w:ascii="Consolas" w:hAnsi="Consolas"/>
+          <w:color w:val="1A1A1A"/>
+          <w:sz w:val="18"/>
+        </w:rPr>
+        <w:t># 3. Remediation requires customer infrastructure — provision it</w:t>
+      </w:r>
+      <w:r>
+        <w:br/>
+      </w:r>
+      <w:r>
+        <w:rPr>
+          <w:rFonts w:ascii="Consolas" w:hAnsi="Consolas"/>
+          <w:color w:val="1A1A1A"/>
+          <w:sz w:val="18"/>
+        </w:rPr>
+        <w:t>atx ct remote network discover                      # find a private subnet with NAT egress</w:t>
+      </w:r>
+      <w:r>
+        <w:br/>
+      </w:r>
+      <w:r>
+        <w:rPr>
+          <w:rFonts w:ascii="Consolas" w:hAnsi="Consolas"/>
+          <w:color w:val="1A1A1A"/>
+          <w:sz w:val="18"/>
+        </w:rPr>
+        <w:t>atx ct remote provision --mode ec2 --vpc &lt;vpc-id&gt; --subnets &lt;subnet-id&gt; \</w:t>
+      </w:r>
+      <w:r>
+        <w:br/>
+      </w:r>
+      <w:r>
+        <w:rPr>
+          <w:rFonts w:ascii="Consolas" w:hAnsi="Consolas"/>
+          <w:color w:val="1A1A1A"/>
+          <w:sz w:val="18"/>
+        </w:rPr>
+        <w:t xml:space="preserve">  --tags "owner=umzahid,temporary=true" --skip-scheduler --execute</w:t>
+      </w:r>
+      <w:r>
+        <w:br/>
+      </w:r>
+      <w:r>
+        <w:rPr>
+          <w:rFonts w:ascii="Consolas" w:hAnsi="Consolas"/>
+          <w:color w:val="1A1A1A"/>
+          <w:sz w:val="18"/>
+        </w:rPr>
+        <w:t xml:space="preserve"> </w:t>
+      </w:r>
+      <w:r>
+        <w:br/>
+      </w:r>
+      <w:r>
+        <w:rPr>
+          <w:rFonts w:ascii="Consolas" w:hAnsi="Consolas"/>
+          <w:color w:val="1A1A1A"/>
+          <w:sz w:val="18"/>
+        </w:rPr>
+        <w:t># 4. Run remediation remotely (one call per repo/transformation)</w:t>
+      </w:r>
+      <w:r>
+        <w:br/>
+      </w:r>
+      <w:r>
+        <w:rPr>
+          <w:rFonts w:ascii="Consolas" w:hAnsi="Consolas"/>
+          <w:color w:val="1A1A1A"/>
+          <w:sz w:val="18"/>
+        </w:rPr>
+        <w:t>atx ct remote remediation --repos "gh-demo::repo-a" \</w:t>
+      </w:r>
+      <w:r>
+        <w:br/>
+      </w:r>
+      <w:r>
+        <w:rPr>
+          <w:rFonts w:ascii="Consolas" w:hAnsi="Consolas"/>
+          <w:color w:val="1A1A1A"/>
+          <w:sz w:val="18"/>
+        </w:rPr>
+        <w:t xml:space="preserve">  --transformation-name AWS/python-version-upgrade \</w:t>
+      </w:r>
+      <w:r>
+        <w:br/>
+      </w:r>
+      <w:r>
+        <w:rPr>
+          <w:rFonts w:ascii="Consolas" w:hAnsi="Consolas"/>
+          <w:color w:val="1A1A1A"/>
+          <w:sz w:val="18"/>
+        </w:rPr>
+        <w:t xml:space="preserve">  --configuration additionalPlanContext="...upgraded to Python 3.13" \</w:t>
+      </w:r>
+      <w:r>
+        <w:br/>
+      </w:r>
+      <w:r>
+        <w:rPr>
+          <w:rFonts w:ascii="Consolas" w:hAnsi="Consolas"/>
+          <w:color w:val="1A1A1A"/>
+          <w:sz w:val="18"/>
+        </w:rPr>
+        <w:t xml:space="preserve">  --mode ec2 --stack-name atx-runner</w:t>
+      </w:r>
+      <w:r>
+        <w:br/>
+      </w:r>
+      <w:r>
+        <w:rPr>
+          <w:rFonts w:ascii="Consolas" w:hAnsi="Consolas"/>
+          <w:color w:val="1A1A1A"/>
+          <w:sz w:val="18"/>
+        </w:rPr>
+        <w:t xml:space="preserve"> </w:t>
+      </w:r>
+      <w:r>
+        <w:br/>
+      </w:r>
+      <w:r>
+        <w:rPr>
+          <w:rFonts w:ascii="Consolas" w:hAnsi="Consolas"/>
+          <w:color w:val="1A1A1A"/>
+          <w:sz w:val="18"/>
+        </w:rPr>
+        <w:t># 5. Tear down when done</w:t>
+      </w:r>
+      <w:r>
+        <w:br/>
+      </w:r>
+      <w:r>
+        <w:rPr>
+          <w:rFonts w:ascii="Consolas" w:hAnsi="Consolas"/>
+          <w:color w:val="1A1A1A"/>
+          <w:sz w:val="18"/>
+        </w:rPr>
+        <w:t>atx ct remote teardown --mode ec2 --stack-name atx-runner --execute</w:t>
+      </w:r>
+    </w:p>
+    <w:p>
+      <w:pPr>
+        <w:pStyle w:val="Heading2"/>
+      </w:pPr>
+      <w:r>
+        <w:t>Final Output</w:t>
+      </w:r>
+    </w:p>
+    <w:tbl>
+      <w:tblPr>
+        <w:tblStyle w:val="LightGrid-Accent1"/>
+        <w:tblW w:type="auto" w:w="0"/>
+        <w:jc w:val="center"/>
+        <w:tblLook w:firstColumn="1" w:firstRow="1" w:lastColumn="0" w:lastRow="0" w:noHBand="0" w:noVBand="1" w:val="04A0"/>
+      </w:tblPr>
+      <w:tblGrid>
+        <w:gridCol w:w="2880"/>
+        <w:gridCol w:w="2880"/>
+        <w:gridCol w:w="2880"/>
+      </w:tblGrid>
+      <w:tr>
+        <w:tc>
+          <w:tcPr>
+            <w:tcW w:type="dxa" w:w="3168"/>
+            <w:shd w:val="clear" w:color="auto" w:fill="2E5395"/>
+          </w:tcPr>
+          <w:p>
+            <w:r>
+              <w:rPr>
+                <w:b/>
+                <w:color w:val="FFFFFF"/>
+                <w:sz w:val="20"/>
+              </w:rPr>
+              <w:t>Repo</w:t>
+            </w:r>
+          </w:p>
+        </w:tc>
+        <w:tc>
+          <w:tcPr>
+            <w:tcW w:type="dxa" w:w="3456"/>
+            <w:shd w:val="clear" w:color="auto" w:fill="2E5395"/>
+          </w:tcPr>
+          <w:p>
+            <w:r>
+              <w:rPr>
+                <w:b/>
+                <w:color w:val="FFFFFF"/>
+                <w:sz w:val="20"/>
+              </w:rPr>
+              <w:t>Transformation</w:t>
+            </w:r>
+          </w:p>
+        </w:tc>
+        <w:tc>
+          <w:tcPr>
+            <w:tcW w:type="dxa" w:w="2880"/>
+            <w:shd w:val="clear" w:color="auto" w:fill="2E5395"/>
+          </w:tcPr>
+          <w:p>
+            <w:r>
+              <w:rPr>
+                <w:b/>
+                <w:color w:val="FFFFFF"/>
+                <w:sz w:val="20"/>
+              </w:rPr>
+              <w:t>Result</w:t>
+            </w:r>
+          </w:p>
+        </w:tc>
+      </w:tr>
+      <w:tr>
+        <w:tc>
+          <w:tcPr>
+            <w:tcW w:type="dxa" w:w="3168"/>
+          </w:tcPr>
+          <w:p>
+            <w:r>
+              <w:rPr>
+                <w:sz w:val="20"/>
+              </w:rPr>
+              <w:t>atx-ct-demo-python-app</w:t>
+            </w:r>
+          </w:p>
+        </w:tc>
+        <w:tc>
+          <w:tcPr>
+            <w:tcW w:type="dxa" w:w="3456"/>
+          </w:tcPr>
+          <w:p>
+            <w:r>
+              <w:rPr>
+                <w:sz w:val="20"/>
+              </w:rPr>
+              <w:t>AWS/python-version-upgrade</w:t>
+            </w:r>
+          </w:p>
+        </w:tc>
+        <w:tc>
+          <w:tcPr>
+            <w:tcW w:type="dxa" w:w="2880"/>
+          </w:tcPr>
+          <w:p>
+            <w:r>
+              <w:rPr>
+                <w:sz w:val="20"/>
+              </w:rPr>
+              <w:t>PR #1 opened, merged — identical diff to Use Case 2</w:t>
+            </w:r>
+          </w:p>
+        </w:tc>
+      </w:tr>
+      <w:tr>
+        <w:tc>
+          <w:tcPr>
+            <w:tcW w:type="dxa" w:w="3168"/>
+          </w:tcPr>
+          <w:p>
+            <w:r>
+              <w:rPr>
+                <w:sz w:val="20"/>
+              </w:rPr>
+              <w:t>atx-ct-demo-node-app</w:t>
+            </w:r>
+          </w:p>
+        </w:tc>
+        <w:tc>
+          <w:tcPr>
+            <w:tcW w:type="dxa" w:w="3456"/>
+          </w:tcPr>
+          <w:p>
+            <w:r>
+              <w:rPr>
+                <w:sz w:val="20"/>
+              </w:rPr>
+              <w:t>AWS/nodejs-version-upgrade</w:t>
+            </w:r>
+          </w:p>
+        </w:tc>
+        <w:tc>
+          <w:tcPr>
+            <w:tcW w:type="dxa" w:w="2880"/>
+          </w:tcPr>
+          <w:p>
+            <w:r>
+              <w:rPr>
+                <w:sz w:val="20"/>
+              </w:rPr>
+              <w:t>PR #1 opened, merged — identical diff to Use Case 4</w:t>
+            </w:r>
+          </w:p>
+        </w:tc>
+      </w:tr>
+    </w:tbl>
+    <w:p/>
+    <w:p>
+      <w:r>
+        <w:rPr>
+          <w:b w:val="0"/>
+          <w:i w:val="0"/>
+        </w:rPr>
+        <w:t>Both diffs were verified identical to running the same transformations locally earlier in this exercise — the remote path produces the same correct result, just delivered as a real GitHub pull request instead of a local git branch.</w:t>
+      </w:r>
+    </w:p>
+    <w:p>
+      <w:r>
+        <w:rPr>
+          <w:b w:val="0"/>
+          <w:i/>
+        </w:rPr>
+        <w:t>Agent Minutes used: 122.33m for analysis (2 repos) + 14.79m and 18.38m for the two remediations.</w:t>
+      </w:r>
+    </w:p>
+    <w:p>
+      <w:pPr>
+        <w:pStyle w:val="Heading2"/>
+      </w:pPr>
+      <w:r>
+        <w:t>Findings and Lessons Learned</w:t>
+      </w:r>
+    </w:p>
+    <w:p>
+      <w:pPr>
+        <w:pStyle w:val="ListBullet"/>
+      </w:pPr>
+      <w:r>
+        <w:rPr>
+          <w:b/>
+        </w:rPr>
+        <w:t xml:space="preserve">aws-managed mode is analysis-only. </w:t>
+      </w:r>
+      <w:r>
+        <w:t>Confirmed both in AWS’s own documentation and by testing directly: remediation (the actual code-fixing step) only supports --mode ec2 or --mode batch. There is no way to run remediation without provisioning customer infrastructure, regardless of source type.</w:t>
+      </w:r>
+    </w:p>
+    <w:p>
+      <w:pPr>
+        <w:pStyle w:val="ListBullet"/>
+      </w:pPr>
+      <w:r>
+        <w:rPr>
+          <w:b/>
+        </w:rPr>
+        <w:t xml:space="preserve">Local-provider sources cannot use aws-managed mode at all. </w:t>
+      </w:r>
+      <w:r>
+        <w:t>The managed fleet has no way to fetch files that only exist on your machine — aws-managed requires a GitHub/GitLab/Bitbucket source.</w:t>
+      </w:r>
+    </w:p>
+    <w:p>
+      <w:pPr>
+        <w:pStyle w:val="ListBullet"/>
+      </w:pPr>
+      <w:r>
+        <w:rPr>
+          <w:b/>
+        </w:rPr>
+        <w:t xml:space="preserve">Reused private subnets must be checked for real internet egress before use. </w:t>
+      </w:r>
+      <w:r>
+        <w:t>The first provisioning attempt used an existing private subnet with no NAT gateway route (only a narrow VPC endpoint) — the EC2 instance couldn’t reach the internet to pull its container image or signal CloudFormation, and the stack failed on a signal timeout. The fix was checking route tables for a 0.0.0.0/0 → NAT gateway route before picking a subnet.</w:t>
+      </w:r>
+    </w:p>
+    <w:p>
+      <w:pPr>
+        <w:pStyle w:val="ListBullet"/>
+      </w:pPr>
+      <w:r>
+        <w:rPr>
+          <w:b/>
+        </w:rPr>
+        <w:t xml:space="preserve">Shared AWS accounts can hit hard quota walls. </w:t>
+      </w:r>
+      <w:r>
+        <w:t>The account was already at its VPC limit (6), blocking creation of a dedicated isolated VPC for this test — the practical workaround was reusing an existing subnet, chosen carefully to avoid other users’ dedicated project networks where possible.</w:t>
+      </w:r>
+    </w:p>
+    <w:p>
+      <w:pPr>
+        <w:pStyle w:val="ListBullet"/>
+      </w:pPr>
+      <w:r>
+        <w:rPr>
+          <w:b/>
+        </w:rPr>
+        <w:t xml:space="preserve">Org-level tag policies can silently break stack creation. </w:t>
+      </w:r>
+      <w:r>
+        <w:t>A CloudFormation deployment failed because a custom tag key (purpose) collided with an AWS Organizations tag policy governing that exact key’s capitalization/allowed values — avoided by using different tag keys entirely.</w:t>
+      </w:r>
+    </w:p>
+    <w:p>
+      <w:pPr>
+        <w:pStyle w:val="ListBullet"/>
+      </w:pPr>
+      <w:r>
+        <w:rPr>
+          <w:b/>
+        </w:rPr>
+        <w:t xml:space="preserve">A GitHub source token sees the whole account, not just intended repos. </w:t>
+      </w:r>
+      <w:r>
+        <w:t>Registering a personal access token scoped at the org/user level made all 11 repositories in the account discoverable, not just the 2 intended for this test. Repos not meant to be in scope were explicitly deleted from the atx ct catalog rather than left registered — a fine-grained, repo-scoped token would avoid this exposure in the first place.</w:t>
+      </w:r>
+    </w:p>
+    <w:p>
+      <w:pPr>
+        <w:pStyle w:val="ListBullet"/>
+      </w:pPr>
+      <w:r>
+        <w:rPr>
+          <w:b/>
+        </w:rPr>
+        <w:t xml:space="preserve">Remediation opens PRs as drafts. </w:t>
+      </w:r>
+      <w:r>
+        <w:t>Both remediation runs opened their pull requests in draft state — they had to be marked ready for review before they could be merged.</w:t>
+      </w:r>
+    </w:p>
+    <w:p>
+      <w:pPr>
+        <w:pStyle w:val="ListBullet"/>
+      </w:pPr>
+      <w:r>
+        <w:rPr>
+          <w:b/>
+        </w:rPr>
+        <w:t xml:space="preserve">Credential hygiene matters even with automation. </w:t>
+      </w:r>
+      <w:r>
+        <w:t>A GitHub token was briefly exposed in plaintext when pasted into a terminal command rather than being kept out of the visible command history — a reminder that CLI --token flags are not a safe way to handle secrets in shared or logged contexts.</w:t>
       </w:r>
     </w:p>
     <w:sectPr>

</xml_diff>